<commit_message>
Add Postal Code column to the placement list template
New column after Placement Address & Phone on the board Co-op
Placement Template (Ledger); neighbouring columns narrowed so the
table still fits one 11x17 page.

Co-Authored-By: Claude Fable 5 <noreply@anthropic.com>
Claude-Session: https://claude.ai/code/session_01AmWYG9kjmQZRP6t92aRL6s
</commit_message>
<xml_diff>
--- a/public/documents/Co-op Placement Template - Ledger.docx
+++ b/public/documents/Co-op Placement Template - Ledger.docx
@@ -475,9 +475,10 @@
         <w:gridCol w:w="850"/>
         <w:gridCol w:w="1200"/>
         <w:gridCol w:w="3200"/>
-        <w:gridCol w:w="3300"/>
-        <w:gridCol w:w="2900"/>
-        <w:gridCol w:w="2900"/>
+        <w:gridCol w:w="2600"/>
+        <w:gridCol w:w="1300"/>
+        <w:gridCol w:w="2700"/>
+        <w:gridCol w:w="2500"/>
         <w:gridCol w:w="1050"/>
         <w:gridCol w:w="1050"/>
         <w:gridCol w:w="1200"/>
@@ -727,6 +728,38 @@
                 <w:sz w:val="18"/>
                 <w:szCs w:val="18"/>
               </w:rPr>
+              <w:t xml:space="preserve">Postal Code</w:t>
+            </w:r>
+          </w:p>
+        </w:tc>
+        <w:tc>
+          <w:tcPr>
+            <w:tcW w:type="dxa" w:w="2900"/>
+            <w:shd w:fill="D9D9D9" w:val="clear"/>
+            <w:tcMar>
+              <w:top w:type="dxa" w:w="20"/>
+              <w:left w:type="dxa" w:w="60"/>
+              <w:bottom w:type="dxa" w:w="20"/>
+              <w:right w:type="dxa" w:w="60"/>
+            </w:tcMar>
+            <w:vAlign w:val="center"/>
+          </w:tcPr>
+          <w:p>
+            <w:pPr>
+              <w:spacing w:after="0" w:before="0" w:line="240" w:lineRule="auto"/>
+              <w:jc w:val="center"/>
+            </w:pPr>
+            <w:r>
+              <w:rPr>
+                <w:rFonts w:ascii="Calibri" w:cs="Calibri" w:eastAsia="Calibri" w:hAnsi="Calibri"/>
+                <w:b/>
+                <w:bCs/>
+                <w:i w:val="false"/>
+                <w:iCs w:val="false"/>
+                <w:color w:val="000000"/>
+                <w:sz w:val="18"/>
+                <w:szCs w:val="18"/>
+              </w:rPr>
               <w:t xml:space="preserve">Supervisor</w:t>
             </w:r>
           </w:p>
@@ -1141,6 +1174,37 @@
         </w:tc>
         <w:tc>
           <w:tcPr>
+            <w:tcW w:type="dxa" w:w="3300"/>
+            <w:tcMar>
+              <w:top w:type="dxa" w:w="20"/>
+              <w:left w:type="dxa" w:w="60"/>
+              <w:bottom w:type="dxa" w:w="20"/>
+              <w:right w:type="dxa" w:w="60"/>
+            </w:tcMar>
+            <w:vAlign w:val="center"/>
+          </w:tcPr>
+          <w:p>
+            <w:pPr>
+              <w:spacing w:after="0" w:before="0" w:line="240" w:lineRule="auto"/>
+              <w:jc w:val="left"/>
+            </w:pPr>
+            <w:r>
+              <w:rPr>
+                <w:rFonts w:ascii="Calibri" w:cs="Calibri" w:eastAsia="Calibri" w:hAnsi="Calibri"/>
+                <w:b w:val="false"/>
+                <w:bCs w:val="false"/>
+                <w:i w:val="false"/>
+                <w:iCs w:val="false"/>
+                <w:color w:val="000000"/>
+                <w:sz w:val="18"/>
+                <w:szCs w:val="18"/>
+              </w:rPr>
+              <w:t xml:space="preserve"/>
+            </w:r>
+          </w:p>
+        </w:tc>
+        <w:tc>
+          <w:tcPr>
             <w:tcW w:type="dxa" w:w="2900"/>
             <w:tcMar>
               <w:top w:type="dxa" w:w="20"/>
@@ -1524,6 +1588,38 @@
         </w:tc>
         <w:tc>
           <w:tcPr>
+            <w:tcW w:type="dxa" w:w="3300"/>
+            <w:shd w:fill="F2F2F2" w:val="clear"/>
+            <w:tcMar>
+              <w:top w:type="dxa" w:w="20"/>
+              <w:left w:type="dxa" w:w="60"/>
+              <w:bottom w:type="dxa" w:w="20"/>
+              <w:right w:type="dxa" w:w="60"/>
+            </w:tcMar>
+            <w:vAlign w:val="center"/>
+          </w:tcPr>
+          <w:p>
+            <w:pPr>
+              <w:spacing w:after="0" w:before="0" w:line="240" w:lineRule="auto"/>
+              <w:jc w:val="left"/>
+            </w:pPr>
+            <w:r>
+              <w:rPr>
+                <w:rFonts w:ascii="Calibri" w:cs="Calibri" w:eastAsia="Calibri" w:hAnsi="Calibri"/>
+                <w:b w:val="false"/>
+                <w:bCs w:val="false"/>
+                <w:i w:val="false"/>
+                <w:iCs w:val="false"/>
+                <w:color w:val="000000"/>
+                <w:sz w:val="18"/>
+                <w:szCs w:val="18"/>
+              </w:rPr>
+              <w:t xml:space="preserve"/>
+            </w:r>
+          </w:p>
+        </w:tc>
+        <w:tc>
+          <w:tcPr>
             <w:tcW w:type="dxa" w:w="2900"/>
             <w:shd w:fill="F2F2F2" w:val="clear"/>
             <w:tcMar>
@@ -1907,6 +2003,37 @@
         </w:tc>
         <w:tc>
           <w:tcPr>
+            <w:tcW w:type="dxa" w:w="3300"/>
+            <w:tcMar>
+              <w:top w:type="dxa" w:w="20"/>
+              <w:left w:type="dxa" w:w="60"/>
+              <w:bottom w:type="dxa" w:w="20"/>
+              <w:right w:type="dxa" w:w="60"/>
+            </w:tcMar>
+            <w:vAlign w:val="center"/>
+          </w:tcPr>
+          <w:p>
+            <w:pPr>
+              <w:spacing w:after="0" w:before="0" w:line="240" w:lineRule="auto"/>
+              <w:jc w:val="left"/>
+            </w:pPr>
+            <w:r>
+              <w:rPr>
+                <w:rFonts w:ascii="Calibri" w:cs="Calibri" w:eastAsia="Calibri" w:hAnsi="Calibri"/>
+                <w:b w:val="false"/>
+                <w:bCs w:val="false"/>
+                <w:i w:val="false"/>
+                <w:iCs w:val="false"/>
+                <w:color w:val="000000"/>
+                <w:sz w:val="18"/>
+                <w:szCs w:val="18"/>
+              </w:rPr>
+              <w:t xml:space="preserve"/>
+            </w:r>
+          </w:p>
+        </w:tc>
+        <w:tc>
+          <w:tcPr>
             <w:tcW w:type="dxa" w:w="2900"/>
             <w:tcMar>
               <w:top w:type="dxa" w:w="20"/>
@@ -2290,6 +2417,38 @@
         </w:tc>
         <w:tc>
           <w:tcPr>
+            <w:tcW w:type="dxa" w:w="3300"/>
+            <w:shd w:fill="F2F2F2" w:val="clear"/>
+            <w:tcMar>
+              <w:top w:type="dxa" w:w="20"/>
+              <w:left w:type="dxa" w:w="60"/>
+              <w:bottom w:type="dxa" w:w="20"/>
+              <w:right w:type="dxa" w:w="60"/>
+            </w:tcMar>
+            <w:vAlign w:val="center"/>
+          </w:tcPr>
+          <w:p>
+            <w:pPr>
+              <w:spacing w:after="0" w:before="0" w:line="240" w:lineRule="auto"/>
+              <w:jc w:val="left"/>
+            </w:pPr>
+            <w:r>
+              <w:rPr>
+                <w:rFonts w:ascii="Calibri" w:cs="Calibri" w:eastAsia="Calibri" w:hAnsi="Calibri"/>
+                <w:b w:val="false"/>
+                <w:bCs w:val="false"/>
+                <w:i w:val="false"/>
+                <w:iCs w:val="false"/>
+                <w:color w:val="000000"/>
+                <w:sz w:val="18"/>
+                <w:szCs w:val="18"/>
+              </w:rPr>
+              <w:t xml:space="preserve"/>
+            </w:r>
+          </w:p>
+        </w:tc>
+        <w:tc>
+          <w:tcPr>
             <w:tcW w:type="dxa" w:w="2900"/>
             <w:shd w:fill="F2F2F2" w:val="clear"/>
             <w:tcMar>
@@ -2673,6 +2832,37 @@
         </w:tc>
         <w:tc>
           <w:tcPr>
+            <w:tcW w:type="dxa" w:w="3300"/>
+            <w:tcMar>
+              <w:top w:type="dxa" w:w="20"/>
+              <w:left w:type="dxa" w:w="60"/>
+              <w:bottom w:type="dxa" w:w="20"/>
+              <w:right w:type="dxa" w:w="60"/>
+            </w:tcMar>
+            <w:vAlign w:val="center"/>
+          </w:tcPr>
+          <w:p>
+            <w:pPr>
+              <w:spacing w:after="0" w:before="0" w:line="240" w:lineRule="auto"/>
+              <w:jc w:val="left"/>
+            </w:pPr>
+            <w:r>
+              <w:rPr>
+                <w:rFonts w:ascii="Calibri" w:cs="Calibri" w:eastAsia="Calibri" w:hAnsi="Calibri"/>
+                <w:b w:val="false"/>
+                <w:bCs w:val="false"/>
+                <w:i w:val="false"/>
+                <w:iCs w:val="false"/>
+                <w:color w:val="000000"/>
+                <w:sz w:val="18"/>
+                <w:szCs w:val="18"/>
+              </w:rPr>
+              <w:t xml:space="preserve"/>
+            </w:r>
+          </w:p>
+        </w:tc>
+        <w:tc>
+          <w:tcPr>
             <w:tcW w:type="dxa" w:w="2900"/>
             <w:tcMar>
               <w:top w:type="dxa" w:w="20"/>
@@ -3056,6 +3246,38 @@
         </w:tc>
         <w:tc>
           <w:tcPr>
+            <w:tcW w:type="dxa" w:w="3300"/>
+            <w:shd w:fill="F2F2F2" w:val="clear"/>
+            <w:tcMar>
+              <w:top w:type="dxa" w:w="20"/>
+              <w:left w:type="dxa" w:w="60"/>
+              <w:bottom w:type="dxa" w:w="20"/>
+              <w:right w:type="dxa" w:w="60"/>
+            </w:tcMar>
+            <w:vAlign w:val="center"/>
+          </w:tcPr>
+          <w:p>
+            <w:pPr>
+              <w:spacing w:after="0" w:before="0" w:line="240" w:lineRule="auto"/>
+              <w:jc w:val="left"/>
+            </w:pPr>
+            <w:r>
+              <w:rPr>
+                <w:rFonts w:ascii="Calibri" w:cs="Calibri" w:eastAsia="Calibri" w:hAnsi="Calibri"/>
+                <w:b w:val="false"/>
+                <w:bCs w:val="false"/>
+                <w:i w:val="false"/>
+                <w:iCs w:val="false"/>
+                <w:color w:val="000000"/>
+                <w:sz w:val="18"/>
+                <w:szCs w:val="18"/>
+              </w:rPr>
+              <w:t xml:space="preserve"/>
+            </w:r>
+          </w:p>
+        </w:tc>
+        <w:tc>
+          <w:tcPr>
             <w:tcW w:type="dxa" w:w="2900"/>
             <w:shd w:fill="F2F2F2" w:val="clear"/>
             <w:tcMar>
@@ -3439,6 +3661,37 @@
         </w:tc>
         <w:tc>
           <w:tcPr>
+            <w:tcW w:type="dxa" w:w="3300"/>
+            <w:tcMar>
+              <w:top w:type="dxa" w:w="20"/>
+              <w:left w:type="dxa" w:w="60"/>
+              <w:bottom w:type="dxa" w:w="20"/>
+              <w:right w:type="dxa" w:w="60"/>
+            </w:tcMar>
+            <w:vAlign w:val="center"/>
+          </w:tcPr>
+          <w:p>
+            <w:pPr>
+              <w:spacing w:after="0" w:before="0" w:line="240" w:lineRule="auto"/>
+              <w:jc w:val="left"/>
+            </w:pPr>
+            <w:r>
+              <w:rPr>
+                <w:rFonts w:ascii="Calibri" w:cs="Calibri" w:eastAsia="Calibri" w:hAnsi="Calibri"/>
+                <w:b w:val="false"/>
+                <w:bCs w:val="false"/>
+                <w:i w:val="false"/>
+                <w:iCs w:val="false"/>
+                <w:color w:val="000000"/>
+                <w:sz w:val="18"/>
+                <w:szCs w:val="18"/>
+              </w:rPr>
+              <w:t xml:space="preserve"/>
+            </w:r>
+          </w:p>
+        </w:tc>
+        <w:tc>
+          <w:tcPr>
             <w:tcW w:type="dxa" w:w="2900"/>
             <w:tcMar>
               <w:top w:type="dxa" w:w="20"/>
@@ -3822,6 +4075,38 @@
         </w:tc>
         <w:tc>
           <w:tcPr>
+            <w:tcW w:type="dxa" w:w="3300"/>
+            <w:shd w:fill="F2F2F2" w:val="clear"/>
+            <w:tcMar>
+              <w:top w:type="dxa" w:w="20"/>
+              <w:left w:type="dxa" w:w="60"/>
+              <w:bottom w:type="dxa" w:w="20"/>
+              <w:right w:type="dxa" w:w="60"/>
+            </w:tcMar>
+            <w:vAlign w:val="center"/>
+          </w:tcPr>
+          <w:p>
+            <w:pPr>
+              <w:spacing w:after="0" w:before="0" w:line="240" w:lineRule="auto"/>
+              <w:jc w:val="left"/>
+            </w:pPr>
+            <w:r>
+              <w:rPr>
+                <w:rFonts w:ascii="Calibri" w:cs="Calibri" w:eastAsia="Calibri" w:hAnsi="Calibri"/>
+                <w:b w:val="false"/>
+                <w:bCs w:val="false"/>
+                <w:i w:val="false"/>
+                <w:iCs w:val="false"/>
+                <w:color w:val="000000"/>
+                <w:sz w:val="18"/>
+                <w:szCs w:val="18"/>
+              </w:rPr>
+              <w:t xml:space="preserve"/>
+            </w:r>
+          </w:p>
+        </w:tc>
+        <w:tc>
+          <w:tcPr>
             <w:tcW w:type="dxa" w:w="2900"/>
             <w:shd w:fill="F2F2F2" w:val="clear"/>
             <w:tcMar>
@@ -4205,6 +4490,37 @@
         </w:tc>
         <w:tc>
           <w:tcPr>
+            <w:tcW w:type="dxa" w:w="3300"/>
+            <w:tcMar>
+              <w:top w:type="dxa" w:w="20"/>
+              <w:left w:type="dxa" w:w="60"/>
+              <w:bottom w:type="dxa" w:w="20"/>
+              <w:right w:type="dxa" w:w="60"/>
+            </w:tcMar>
+            <w:vAlign w:val="center"/>
+          </w:tcPr>
+          <w:p>
+            <w:pPr>
+              <w:spacing w:after="0" w:before="0" w:line="240" w:lineRule="auto"/>
+              <w:jc w:val="left"/>
+            </w:pPr>
+            <w:r>
+              <w:rPr>
+                <w:rFonts w:ascii="Calibri" w:cs="Calibri" w:eastAsia="Calibri" w:hAnsi="Calibri"/>
+                <w:b w:val="false"/>
+                <w:bCs w:val="false"/>
+                <w:i w:val="false"/>
+                <w:iCs w:val="false"/>
+                <w:color w:val="000000"/>
+                <w:sz w:val="18"/>
+                <w:szCs w:val="18"/>
+              </w:rPr>
+              <w:t xml:space="preserve"/>
+            </w:r>
+          </w:p>
+        </w:tc>
+        <w:tc>
+          <w:tcPr>
             <w:tcW w:type="dxa" w:w="2900"/>
             <w:tcMar>
               <w:top w:type="dxa" w:w="20"/>
@@ -4588,6 +4904,38 @@
         </w:tc>
         <w:tc>
           <w:tcPr>
+            <w:tcW w:type="dxa" w:w="3300"/>
+            <w:shd w:fill="F2F2F2" w:val="clear"/>
+            <w:tcMar>
+              <w:top w:type="dxa" w:w="20"/>
+              <w:left w:type="dxa" w:w="60"/>
+              <w:bottom w:type="dxa" w:w="20"/>
+              <w:right w:type="dxa" w:w="60"/>
+            </w:tcMar>
+            <w:vAlign w:val="center"/>
+          </w:tcPr>
+          <w:p>
+            <w:pPr>
+              <w:spacing w:after="0" w:before="0" w:line="240" w:lineRule="auto"/>
+              <w:jc w:val="left"/>
+            </w:pPr>
+            <w:r>
+              <w:rPr>
+                <w:rFonts w:ascii="Calibri" w:cs="Calibri" w:eastAsia="Calibri" w:hAnsi="Calibri"/>
+                <w:b w:val="false"/>
+                <w:bCs w:val="false"/>
+                <w:i w:val="false"/>
+                <w:iCs w:val="false"/>
+                <w:color w:val="000000"/>
+                <w:sz w:val="18"/>
+                <w:szCs w:val="18"/>
+              </w:rPr>
+              <w:t xml:space="preserve"/>
+            </w:r>
+          </w:p>
+        </w:tc>
+        <w:tc>
+          <w:tcPr>
             <w:tcW w:type="dxa" w:w="2900"/>
             <w:shd w:fill="F2F2F2" w:val="clear"/>
             <w:tcMar>
@@ -4971,6 +5319,37 @@
         </w:tc>
         <w:tc>
           <w:tcPr>
+            <w:tcW w:type="dxa" w:w="3300"/>
+            <w:tcMar>
+              <w:top w:type="dxa" w:w="20"/>
+              <w:left w:type="dxa" w:w="60"/>
+              <w:bottom w:type="dxa" w:w="20"/>
+              <w:right w:type="dxa" w:w="60"/>
+            </w:tcMar>
+            <w:vAlign w:val="center"/>
+          </w:tcPr>
+          <w:p>
+            <w:pPr>
+              <w:spacing w:after="0" w:before="0" w:line="240" w:lineRule="auto"/>
+              <w:jc w:val="left"/>
+            </w:pPr>
+            <w:r>
+              <w:rPr>
+                <w:rFonts w:ascii="Calibri" w:cs="Calibri" w:eastAsia="Calibri" w:hAnsi="Calibri"/>
+                <w:b w:val="false"/>
+                <w:bCs w:val="false"/>
+                <w:i w:val="false"/>
+                <w:iCs w:val="false"/>
+                <w:color w:val="000000"/>
+                <w:sz w:val="18"/>
+                <w:szCs w:val="18"/>
+              </w:rPr>
+              <w:t xml:space="preserve"/>
+            </w:r>
+          </w:p>
+        </w:tc>
+        <w:tc>
+          <w:tcPr>
             <w:tcW w:type="dxa" w:w="2900"/>
             <w:tcMar>
               <w:top w:type="dxa" w:w="20"/>
@@ -5354,6 +5733,38 @@
         </w:tc>
         <w:tc>
           <w:tcPr>
+            <w:tcW w:type="dxa" w:w="3300"/>
+            <w:shd w:fill="F2F2F2" w:val="clear"/>
+            <w:tcMar>
+              <w:top w:type="dxa" w:w="20"/>
+              <w:left w:type="dxa" w:w="60"/>
+              <w:bottom w:type="dxa" w:w="20"/>
+              <w:right w:type="dxa" w:w="60"/>
+            </w:tcMar>
+            <w:vAlign w:val="center"/>
+          </w:tcPr>
+          <w:p>
+            <w:pPr>
+              <w:spacing w:after="0" w:before="0" w:line="240" w:lineRule="auto"/>
+              <w:jc w:val="left"/>
+            </w:pPr>
+            <w:r>
+              <w:rPr>
+                <w:rFonts w:ascii="Calibri" w:cs="Calibri" w:eastAsia="Calibri" w:hAnsi="Calibri"/>
+                <w:b w:val="false"/>
+                <w:bCs w:val="false"/>
+                <w:i w:val="false"/>
+                <w:iCs w:val="false"/>
+                <w:color w:val="000000"/>
+                <w:sz w:val="18"/>
+                <w:szCs w:val="18"/>
+              </w:rPr>
+              <w:t xml:space="preserve"/>
+            </w:r>
+          </w:p>
+        </w:tc>
+        <w:tc>
+          <w:tcPr>
             <w:tcW w:type="dxa" w:w="2900"/>
             <w:shd w:fill="F2F2F2" w:val="clear"/>
             <w:tcMar>
@@ -5737,6 +6148,37 @@
         </w:tc>
         <w:tc>
           <w:tcPr>
+            <w:tcW w:type="dxa" w:w="3300"/>
+            <w:tcMar>
+              <w:top w:type="dxa" w:w="20"/>
+              <w:left w:type="dxa" w:w="60"/>
+              <w:bottom w:type="dxa" w:w="20"/>
+              <w:right w:type="dxa" w:w="60"/>
+            </w:tcMar>
+            <w:vAlign w:val="center"/>
+          </w:tcPr>
+          <w:p>
+            <w:pPr>
+              <w:spacing w:after="0" w:before="0" w:line="240" w:lineRule="auto"/>
+              <w:jc w:val="left"/>
+            </w:pPr>
+            <w:r>
+              <w:rPr>
+                <w:rFonts w:ascii="Calibri" w:cs="Calibri" w:eastAsia="Calibri" w:hAnsi="Calibri"/>
+                <w:b w:val="false"/>
+                <w:bCs w:val="false"/>
+                <w:i w:val="false"/>
+                <w:iCs w:val="false"/>
+                <w:color w:val="000000"/>
+                <w:sz w:val="18"/>
+                <w:szCs w:val="18"/>
+              </w:rPr>
+              <w:t xml:space="preserve"/>
+            </w:r>
+          </w:p>
+        </w:tc>
+        <w:tc>
+          <w:tcPr>
             <w:tcW w:type="dxa" w:w="2900"/>
             <w:tcMar>
               <w:top w:type="dxa" w:w="20"/>
@@ -6120,6 +6562,38 @@
         </w:tc>
         <w:tc>
           <w:tcPr>
+            <w:tcW w:type="dxa" w:w="3300"/>
+            <w:shd w:fill="F2F2F2" w:val="clear"/>
+            <w:tcMar>
+              <w:top w:type="dxa" w:w="20"/>
+              <w:left w:type="dxa" w:w="60"/>
+              <w:bottom w:type="dxa" w:w="20"/>
+              <w:right w:type="dxa" w:w="60"/>
+            </w:tcMar>
+            <w:vAlign w:val="center"/>
+          </w:tcPr>
+          <w:p>
+            <w:pPr>
+              <w:spacing w:after="0" w:before="0" w:line="240" w:lineRule="auto"/>
+              <w:jc w:val="left"/>
+            </w:pPr>
+            <w:r>
+              <w:rPr>
+                <w:rFonts w:ascii="Calibri" w:cs="Calibri" w:eastAsia="Calibri" w:hAnsi="Calibri"/>
+                <w:b w:val="false"/>
+                <w:bCs w:val="false"/>
+                <w:i w:val="false"/>
+                <w:iCs w:val="false"/>
+                <w:color w:val="000000"/>
+                <w:sz w:val="18"/>
+                <w:szCs w:val="18"/>
+              </w:rPr>
+              <w:t xml:space="preserve"/>
+            </w:r>
+          </w:p>
+        </w:tc>
+        <w:tc>
+          <w:tcPr>
             <w:tcW w:type="dxa" w:w="2900"/>
             <w:shd w:fill="F2F2F2" w:val="clear"/>
             <w:tcMar>
@@ -6503,6 +6977,37 @@
         </w:tc>
         <w:tc>
           <w:tcPr>
+            <w:tcW w:type="dxa" w:w="3300"/>
+            <w:tcMar>
+              <w:top w:type="dxa" w:w="20"/>
+              <w:left w:type="dxa" w:w="60"/>
+              <w:bottom w:type="dxa" w:w="20"/>
+              <w:right w:type="dxa" w:w="60"/>
+            </w:tcMar>
+            <w:vAlign w:val="center"/>
+          </w:tcPr>
+          <w:p>
+            <w:pPr>
+              <w:spacing w:after="0" w:before="0" w:line="240" w:lineRule="auto"/>
+              <w:jc w:val="left"/>
+            </w:pPr>
+            <w:r>
+              <w:rPr>
+                <w:rFonts w:ascii="Calibri" w:cs="Calibri" w:eastAsia="Calibri" w:hAnsi="Calibri"/>
+                <w:b w:val="false"/>
+                <w:bCs w:val="false"/>
+                <w:i w:val="false"/>
+                <w:iCs w:val="false"/>
+                <w:color w:val="000000"/>
+                <w:sz w:val="18"/>
+                <w:szCs w:val="18"/>
+              </w:rPr>
+              <w:t xml:space="preserve"/>
+            </w:r>
+          </w:p>
+        </w:tc>
+        <w:tc>
+          <w:tcPr>
             <w:tcW w:type="dxa" w:w="2900"/>
             <w:tcMar>
               <w:top w:type="dxa" w:w="20"/>
@@ -6886,6 +7391,38 @@
         </w:tc>
         <w:tc>
           <w:tcPr>
+            <w:tcW w:type="dxa" w:w="3300"/>
+            <w:shd w:fill="F2F2F2" w:val="clear"/>
+            <w:tcMar>
+              <w:top w:type="dxa" w:w="20"/>
+              <w:left w:type="dxa" w:w="60"/>
+              <w:bottom w:type="dxa" w:w="20"/>
+              <w:right w:type="dxa" w:w="60"/>
+            </w:tcMar>
+            <w:vAlign w:val="center"/>
+          </w:tcPr>
+          <w:p>
+            <w:pPr>
+              <w:spacing w:after="0" w:before="0" w:line="240" w:lineRule="auto"/>
+              <w:jc w:val="left"/>
+            </w:pPr>
+            <w:r>
+              <w:rPr>
+                <w:rFonts w:ascii="Calibri" w:cs="Calibri" w:eastAsia="Calibri" w:hAnsi="Calibri"/>
+                <w:b w:val="false"/>
+                <w:bCs w:val="false"/>
+                <w:i w:val="false"/>
+                <w:iCs w:val="false"/>
+                <w:color w:val="000000"/>
+                <w:sz w:val="18"/>
+                <w:szCs w:val="18"/>
+              </w:rPr>
+              <w:t xml:space="preserve"/>
+            </w:r>
+          </w:p>
+        </w:tc>
+        <w:tc>
+          <w:tcPr>
             <w:tcW w:type="dxa" w:w="2900"/>
             <w:shd w:fill="F2F2F2" w:val="clear"/>
             <w:tcMar>
@@ -7269,6 +7806,37 @@
         </w:tc>
         <w:tc>
           <w:tcPr>
+            <w:tcW w:type="dxa" w:w="3300"/>
+            <w:tcMar>
+              <w:top w:type="dxa" w:w="20"/>
+              <w:left w:type="dxa" w:w="60"/>
+              <w:bottom w:type="dxa" w:w="20"/>
+              <w:right w:type="dxa" w:w="60"/>
+            </w:tcMar>
+            <w:vAlign w:val="center"/>
+          </w:tcPr>
+          <w:p>
+            <w:pPr>
+              <w:spacing w:after="0" w:before="0" w:line="240" w:lineRule="auto"/>
+              <w:jc w:val="left"/>
+            </w:pPr>
+            <w:r>
+              <w:rPr>
+                <w:rFonts w:ascii="Calibri" w:cs="Calibri" w:eastAsia="Calibri" w:hAnsi="Calibri"/>
+                <w:b w:val="false"/>
+                <w:bCs w:val="false"/>
+                <w:i w:val="false"/>
+                <w:iCs w:val="false"/>
+                <w:color w:val="000000"/>
+                <w:sz w:val="18"/>
+                <w:szCs w:val="18"/>
+              </w:rPr>
+              <w:t xml:space="preserve"/>
+            </w:r>
+          </w:p>
+        </w:tc>
+        <w:tc>
+          <w:tcPr>
             <w:tcW w:type="dxa" w:w="2900"/>
             <w:tcMar>
               <w:top w:type="dxa" w:w="20"/>
@@ -7652,6 +8220,38 @@
         </w:tc>
         <w:tc>
           <w:tcPr>
+            <w:tcW w:type="dxa" w:w="3300"/>
+            <w:shd w:fill="F2F2F2" w:val="clear"/>
+            <w:tcMar>
+              <w:top w:type="dxa" w:w="20"/>
+              <w:left w:type="dxa" w:w="60"/>
+              <w:bottom w:type="dxa" w:w="20"/>
+              <w:right w:type="dxa" w:w="60"/>
+            </w:tcMar>
+            <w:vAlign w:val="center"/>
+          </w:tcPr>
+          <w:p>
+            <w:pPr>
+              <w:spacing w:after="0" w:before="0" w:line="240" w:lineRule="auto"/>
+              <w:jc w:val="left"/>
+            </w:pPr>
+            <w:r>
+              <w:rPr>
+                <w:rFonts w:ascii="Calibri" w:cs="Calibri" w:eastAsia="Calibri" w:hAnsi="Calibri"/>
+                <w:b w:val="false"/>
+                <w:bCs w:val="false"/>
+                <w:i w:val="false"/>
+                <w:iCs w:val="false"/>
+                <w:color w:val="000000"/>
+                <w:sz w:val="18"/>
+                <w:szCs w:val="18"/>
+              </w:rPr>
+              <w:t xml:space="preserve"/>
+            </w:r>
+          </w:p>
+        </w:tc>
+        <w:tc>
+          <w:tcPr>
             <w:tcW w:type="dxa" w:w="2900"/>
             <w:shd w:fill="F2F2F2" w:val="clear"/>
             <w:tcMar>
@@ -8035,6 +8635,37 @@
         </w:tc>
         <w:tc>
           <w:tcPr>
+            <w:tcW w:type="dxa" w:w="3300"/>
+            <w:tcMar>
+              <w:top w:type="dxa" w:w="20"/>
+              <w:left w:type="dxa" w:w="60"/>
+              <w:bottom w:type="dxa" w:w="20"/>
+              <w:right w:type="dxa" w:w="60"/>
+            </w:tcMar>
+            <w:vAlign w:val="center"/>
+          </w:tcPr>
+          <w:p>
+            <w:pPr>
+              <w:spacing w:after="0" w:before="0" w:line="240" w:lineRule="auto"/>
+              <w:jc w:val="left"/>
+            </w:pPr>
+            <w:r>
+              <w:rPr>
+                <w:rFonts w:ascii="Calibri" w:cs="Calibri" w:eastAsia="Calibri" w:hAnsi="Calibri"/>
+                <w:b w:val="false"/>
+                <w:bCs w:val="false"/>
+                <w:i w:val="false"/>
+                <w:iCs w:val="false"/>
+                <w:color w:val="000000"/>
+                <w:sz w:val="18"/>
+                <w:szCs w:val="18"/>
+              </w:rPr>
+              <w:t xml:space="preserve"/>
+            </w:r>
+          </w:p>
+        </w:tc>
+        <w:tc>
+          <w:tcPr>
             <w:tcW w:type="dxa" w:w="2900"/>
             <w:tcMar>
               <w:top w:type="dxa" w:w="20"/>
@@ -8418,6 +9049,38 @@
         </w:tc>
         <w:tc>
           <w:tcPr>
+            <w:tcW w:type="dxa" w:w="3300"/>
+            <w:shd w:fill="F2F2F2" w:val="clear"/>
+            <w:tcMar>
+              <w:top w:type="dxa" w:w="20"/>
+              <w:left w:type="dxa" w:w="60"/>
+              <w:bottom w:type="dxa" w:w="20"/>
+              <w:right w:type="dxa" w:w="60"/>
+            </w:tcMar>
+            <w:vAlign w:val="center"/>
+          </w:tcPr>
+          <w:p>
+            <w:pPr>
+              <w:spacing w:after="0" w:before="0" w:line="240" w:lineRule="auto"/>
+              <w:jc w:val="left"/>
+            </w:pPr>
+            <w:r>
+              <w:rPr>
+                <w:rFonts w:ascii="Calibri" w:cs="Calibri" w:eastAsia="Calibri" w:hAnsi="Calibri"/>
+                <w:b w:val="false"/>
+                <w:bCs w:val="false"/>
+                <w:i w:val="false"/>
+                <w:iCs w:val="false"/>
+                <w:color w:val="000000"/>
+                <w:sz w:val="18"/>
+                <w:szCs w:val="18"/>
+              </w:rPr>
+              <w:t xml:space="preserve"/>
+            </w:r>
+          </w:p>
+        </w:tc>
+        <w:tc>
+          <w:tcPr>
             <w:tcW w:type="dxa" w:w="2900"/>
             <w:shd w:fill="F2F2F2" w:val="clear"/>
             <w:tcMar>
@@ -8801,6 +9464,37 @@
         </w:tc>
         <w:tc>
           <w:tcPr>
+            <w:tcW w:type="dxa" w:w="3300"/>
+            <w:tcMar>
+              <w:top w:type="dxa" w:w="20"/>
+              <w:left w:type="dxa" w:w="60"/>
+              <w:bottom w:type="dxa" w:w="20"/>
+              <w:right w:type="dxa" w:w="60"/>
+            </w:tcMar>
+            <w:vAlign w:val="center"/>
+          </w:tcPr>
+          <w:p>
+            <w:pPr>
+              <w:spacing w:after="0" w:before="0" w:line="240" w:lineRule="auto"/>
+              <w:jc w:val="left"/>
+            </w:pPr>
+            <w:r>
+              <w:rPr>
+                <w:rFonts w:ascii="Calibri" w:cs="Calibri" w:eastAsia="Calibri" w:hAnsi="Calibri"/>
+                <w:b w:val="false"/>
+                <w:bCs w:val="false"/>
+                <w:i w:val="false"/>
+                <w:iCs w:val="false"/>
+                <w:color w:val="000000"/>
+                <w:sz w:val="18"/>
+                <w:szCs w:val="18"/>
+              </w:rPr>
+              <w:t xml:space="preserve"/>
+            </w:r>
+          </w:p>
+        </w:tc>
+        <w:tc>
+          <w:tcPr>
             <w:tcW w:type="dxa" w:w="2900"/>
             <w:tcMar>
               <w:top w:type="dxa" w:w="20"/>
@@ -9184,6 +9878,38 @@
         </w:tc>
         <w:tc>
           <w:tcPr>
+            <w:tcW w:type="dxa" w:w="3300"/>
+            <w:shd w:fill="F2F2F2" w:val="clear"/>
+            <w:tcMar>
+              <w:top w:type="dxa" w:w="20"/>
+              <w:left w:type="dxa" w:w="60"/>
+              <w:bottom w:type="dxa" w:w="20"/>
+              <w:right w:type="dxa" w:w="60"/>
+            </w:tcMar>
+            <w:vAlign w:val="center"/>
+          </w:tcPr>
+          <w:p>
+            <w:pPr>
+              <w:spacing w:after="0" w:before="0" w:line="240" w:lineRule="auto"/>
+              <w:jc w:val="left"/>
+            </w:pPr>
+            <w:r>
+              <w:rPr>
+                <w:rFonts w:ascii="Calibri" w:cs="Calibri" w:eastAsia="Calibri" w:hAnsi="Calibri"/>
+                <w:b w:val="false"/>
+                <w:bCs w:val="false"/>
+                <w:i w:val="false"/>
+                <w:iCs w:val="false"/>
+                <w:color w:val="000000"/>
+                <w:sz w:val="18"/>
+                <w:szCs w:val="18"/>
+              </w:rPr>
+              <w:t xml:space="preserve"/>
+            </w:r>
+          </w:p>
+        </w:tc>
+        <w:tc>
+          <w:tcPr>
             <w:tcW w:type="dxa" w:w="2900"/>
             <w:shd w:fill="F2F2F2" w:val="clear"/>
             <w:tcMar>
@@ -9567,6 +10293,37 @@
         </w:tc>
         <w:tc>
           <w:tcPr>
+            <w:tcW w:type="dxa" w:w="3300"/>
+            <w:tcMar>
+              <w:top w:type="dxa" w:w="20"/>
+              <w:left w:type="dxa" w:w="60"/>
+              <w:bottom w:type="dxa" w:w="20"/>
+              <w:right w:type="dxa" w:w="60"/>
+            </w:tcMar>
+            <w:vAlign w:val="center"/>
+          </w:tcPr>
+          <w:p>
+            <w:pPr>
+              <w:spacing w:after="0" w:before="0" w:line="240" w:lineRule="auto"/>
+              <w:jc w:val="left"/>
+            </w:pPr>
+            <w:r>
+              <w:rPr>
+                <w:rFonts w:ascii="Calibri" w:cs="Calibri" w:eastAsia="Calibri" w:hAnsi="Calibri"/>
+                <w:b w:val="false"/>
+                <w:bCs w:val="false"/>
+                <w:i w:val="false"/>
+                <w:iCs w:val="false"/>
+                <w:color w:val="000000"/>
+                <w:sz w:val="18"/>
+                <w:szCs w:val="18"/>
+              </w:rPr>
+              <w:t xml:space="preserve"/>
+            </w:r>
+          </w:p>
+        </w:tc>
+        <w:tc>
+          <w:tcPr>
             <w:tcW w:type="dxa" w:w="2900"/>
             <w:tcMar>
               <w:top w:type="dxa" w:w="20"/>
@@ -9950,6 +10707,38 @@
         </w:tc>
         <w:tc>
           <w:tcPr>
+            <w:tcW w:type="dxa" w:w="3300"/>
+            <w:shd w:fill="F2F2F2" w:val="clear"/>
+            <w:tcMar>
+              <w:top w:type="dxa" w:w="20"/>
+              <w:left w:type="dxa" w:w="60"/>
+              <w:bottom w:type="dxa" w:w="20"/>
+              <w:right w:type="dxa" w:w="60"/>
+            </w:tcMar>
+            <w:vAlign w:val="center"/>
+          </w:tcPr>
+          <w:p>
+            <w:pPr>
+              <w:spacing w:after="0" w:before="0" w:line="240" w:lineRule="auto"/>
+              <w:jc w:val="left"/>
+            </w:pPr>
+            <w:r>
+              <w:rPr>
+                <w:rFonts w:ascii="Calibri" w:cs="Calibri" w:eastAsia="Calibri" w:hAnsi="Calibri"/>
+                <w:b w:val="false"/>
+                <w:bCs w:val="false"/>
+                <w:i w:val="false"/>
+                <w:iCs w:val="false"/>
+                <w:color w:val="000000"/>
+                <w:sz w:val="18"/>
+                <w:szCs w:val="18"/>
+              </w:rPr>
+              <w:t xml:space="preserve"/>
+            </w:r>
+          </w:p>
+        </w:tc>
+        <w:tc>
+          <w:tcPr>
             <w:tcW w:type="dxa" w:w="2900"/>
             <w:shd w:fill="F2F2F2" w:val="clear"/>
             <w:tcMar>
@@ -10333,6 +11122,37 @@
         </w:tc>
         <w:tc>
           <w:tcPr>
+            <w:tcW w:type="dxa" w:w="3300"/>
+            <w:tcMar>
+              <w:top w:type="dxa" w:w="20"/>
+              <w:left w:type="dxa" w:w="60"/>
+              <w:bottom w:type="dxa" w:w="20"/>
+              <w:right w:type="dxa" w:w="60"/>
+            </w:tcMar>
+            <w:vAlign w:val="center"/>
+          </w:tcPr>
+          <w:p>
+            <w:pPr>
+              <w:spacing w:after="0" w:before="0" w:line="240" w:lineRule="auto"/>
+              <w:jc w:val="left"/>
+            </w:pPr>
+            <w:r>
+              <w:rPr>
+                <w:rFonts w:ascii="Calibri" w:cs="Calibri" w:eastAsia="Calibri" w:hAnsi="Calibri"/>
+                <w:b w:val="false"/>
+                <w:bCs w:val="false"/>
+                <w:i w:val="false"/>
+                <w:iCs w:val="false"/>
+                <w:color w:val="000000"/>
+                <w:sz w:val="18"/>
+                <w:szCs w:val="18"/>
+              </w:rPr>
+              <w:t xml:space="preserve"/>
+            </w:r>
+          </w:p>
+        </w:tc>
+        <w:tc>
+          <w:tcPr>
             <w:tcW w:type="dxa" w:w="2900"/>
             <w:tcMar>
               <w:top w:type="dxa" w:w="20"/>
@@ -10716,6 +11536,38 @@
         </w:tc>
         <w:tc>
           <w:tcPr>
+            <w:tcW w:type="dxa" w:w="3300"/>
+            <w:shd w:fill="F2F2F2" w:val="clear"/>
+            <w:tcMar>
+              <w:top w:type="dxa" w:w="20"/>
+              <w:left w:type="dxa" w:w="60"/>
+              <w:bottom w:type="dxa" w:w="20"/>
+              <w:right w:type="dxa" w:w="60"/>
+            </w:tcMar>
+            <w:vAlign w:val="center"/>
+          </w:tcPr>
+          <w:p>
+            <w:pPr>
+              <w:spacing w:after="0" w:before="0" w:line="240" w:lineRule="auto"/>
+              <w:jc w:val="left"/>
+            </w:pPr>
+            <w:r>
+              <w:rPr>
+                <w:rFonts w:ascii="Calibri" w:cs="Calibri" w:eastAsia="Calibri" w:hAnsi="Calibri"/>
+                <w:b w:val="false"/>
+                <w:bCs w:val="false"/>
+                <w:i w:val="false"/>
+                <w:iCs w:val="false"/>
+                <w:color w:val="000000"/>
+                <w:sz w:val="18"/>
+                <w:szCs w:val="18"/>
+              </w:rPr>
+              <w:t xml:space="preserve"/>
+            </w:r>
+          </w:p>
+        </w:tc>
+        <w:tc>
+          <w:tcPr>
             <w:tcW w:type="dxa" w:w="2900"/>
             <w:shd w:fill="F2F2F2" w:val="clear"/>
             <w:tcMar>
@@ -11099,6 +11951,37 @@
         </w:tc>
         <w:tc>
           <w:tcPr>
+            <w:tcW w:type="dxa" w:w="3300"/>
+            <w:tcMar>
+              <w:top w:type="dxa" w:w="20"/>
+              <w:left w:type="dxa" w:w="60"/>
+              <w:bottom w:type="dxa" w:w="20"/>
+              <w:right w:type="dxa" w:w="60"/>
+            </w:tcMar>
+            <w:vAlign w:val="center"/>
+          </w:tcPr>
+          <w:p>
+            <w:pPr>
+              <w:spacing w:after="0" w:before="0" w:line="240" w:lineRule="auto"/>
+              <w:jc w:val="left"/>
+            </w:pPr>
+            <w:r>
+              <w:rPr>
+                <w:rFonts w:ascii="Calibri" w:cs="Calibri" w:eastAsia="Calibri" w:hAnsi="Calibri"/>
+                <w:b w:val="false"/>
+                <w:bCs w:val="false"/>
+                <w:i w:val="false"/>
+                <w:iCs w:val="false"/>
+                <w:color w:val="000000"/>
+                <w:sz w:val="18"/>
+                <w:szCs w:val="18"/>
+              </w:rPr>
+              <w:t xml:space="preserve"/>
+            </w:r>
+          </w:p>
+        </w:tc>
+        <w:tc>
+          <w:tcPr>
             <w:tcW w:type="dxa" w:w="2900"/>
             <w:tcMar>
               <w:top w:type="dxa" w:w="20"/>
@@ -11482,6 +12365,38 @@
         </w:tc>
         <w:tc>
           <w:tcPr>
+            <w:tcW w:type="dxa" w:w="3300"/>
+            <w:shd w:fill="F2F2F2" w:val="clear"/>
+            <w:tcMar>
+              <w:top w:type="dxa" w:w="20"/>
+              <w:left w:type="dxa" w:w="60"/>
+              <w:bottom w:type="dxa" w:w="20"/>
+              <w:right w:type="dxa" w:w="60"/>
+            </w:tcMar>
+            <w:vAlign w:val="center"/>
+          </w:tcPr>
+          <w:p>
+            <w:pPr>
+              <w:spacing w:after="0" w:before="0" w:line="240" w:lineRule="auto"/>
+              <w:jc w:val="left"/>
+            </w:pPr>
+            <w:r>
+              <w:rPr>
+                <w:rFonts w:ascii="Calibri" w:cs="Calibri" w:eastAsia="Calibri" w:hAnsi="Calibri"/>
+                <w:b w:val="false"/>
+                <w:bCs w:val="false"/>
+                <w:i w:val="false"/>
+                <w:iCs w:val="false"/>
+                <w:color w:val="000000"/>
+                <w:sz w:val="18"/>
+                <w:szCs w:val="18"/>
+              </w:rPr>
+              <w:t xml:space="preserve"/>
+            </w:r>
+          </w:p>
+        </w:tc>
+        <w:tc>
+          <w:tcPr>
             <w:tcW w:type="dxa" w:w="2900"/>
             <w:shd w:fill="F2F2F2" w:val="clear"/>
             <w:tcMar>
@@ -11865,6 +12780,37 @@
         </w:tc>
         <w:tc>
           <w:tcPr>
+            <w:tcW w:type="dxa" w:w="3300"/>
+            <w:tcMar>
+              <w:top w:type="dxa" w:w="20"/>
+              <w:left w:type="dxa" w:w="60"/>
+              <w:bottom w:type="dxa" w:w="20"/>
+              <w:right w:type="dxa" w:w="60"/>
+            </w:tcMar>
+            <w:vAlign w:val="center"/>
+          </w:tcPr>
+          <w:p>
+            <w:pPr>
+              <w:spacing w:after="0" w:before="0" w:line="240" w:lineRule="auto"/>
+              <w:jc w:val="left"/>
+            </w:pPr>
+            <w:r>
+              <w:rPr>
+                <w:rFonts w:ascii="Calibri" w:cs="Calibri" w:eastAsia="Calibri" w:hAnsi="Calibri"/>
+                <w:b w:val="false"/>
+                <w:bCs w:val="false"/>
+                <w:i w:val="false"/>
+                <w:iCs w:val="false"/>
+                <w:color w:val="000000"/>
+                <w:sz w:val="18"/>
+                <w:szCs w:val="18"/>
+              </w:rPr>
+              <w:t xml:space="preserve"/>
+            </w:r>
+          </w:p>
+        </w:tc>
+        <w:tc>
+          <w:tcPr>
             <w:tcW w:type="dxa" w:w="2900"/>
             <w:tcMar>
               <w:top w:type="dxa" w:w="20"/>
@@ -12248,6 +13194,38 @@
         </w:tc>
         <w:tc>
           <w:tcPr>
+            <w:tcW w:type="dxa" w:w="3300"/>
+            <w:shd w:fill="F2F2F2" w:val="clear"/>
+            <w:tcMar>
+              <w:top w:type="dxa" w:w="20"/>
+              <w:left w:type="dxa" w:w="60"/>
+              <w:bottom w:type="dxa" w:w="20"/>
+              <w:right w:type="dxa" w:w="60"/>
+            </w:tcMar>
+            <w:vAlign w:val="center"/>
+          </w:tcPr>
+          <w:p>
+            <w:pPr>
+              <w:spacing w:after="0" w:before="0" w:line="240" w:lineRule="auto"/>
+              <w:jc w:val="left"/>
+            </w:pPr>
+            <w:r>
+              <w:rPr>
+                <w:rFonts w:ascii="Calibri" w:cs="Calibri" w:eastAsia="Calibri" w:hAnsi="Calibri"/>
+                <w:b w:val="false"/>
+                <w:bCs w:val="false"/>
+                <w:i w:val="false"/>
+                <w:iCs w:val="false"/>
+                <w:color w:val="000000"/>
+                <w:sz w:val="18"/>
+                <w:szCs w:val="18"/>
+              </w:rPr>
+              <w:t xml:space="preserve"/>
+            </w:r>
+          </w:p>
+        </w:tc>
+        <w:tc>
+          <w:tcPr>
             <w:tcW w:type="dxa" w:w="2900"/>
             <w:shd w:fill="F2F2F2" w:val="clear"/>
             <w:tcMar>
@@ -12631,6 +13609,37 @@
         </w:tc>
         <w:tc>
           <w:tcPr>
+            <w:tcW w:type="dxa" w:w="3300"/>
+            <w:tcMar>
+              <w:top w:type="dxa" w:w="20"/>
+              <w:left w:type="dxa" w:w="60"/>
+              <w:bottom w:type="dxa" w:w="20"/>
+              <w:right w:type="dxa" w:w="60"/>
+            </w:tcMar>
+            <w:vAlign w:val="center"/>
+          </w:tcPr>
+          <w:p>
+            <w:pPr>
+              <w:spacing w:after="0" w:before="0" w:line="240" w:lineRule="auto"/>
+              <w:jc w:val="left"/>
+            </w:pPr>
+            <w:r>
+              <w:rPr>
+                <w:rFonts w:ascii="Calibri" w:cs="Calibri" w:eastAsia="Calibri" w:hAnsi="Calibri"/>
+                <w:b w:val="false"/>
+                <w:bCs w:val="false"/>
+                <w:i w:val="false"/>
+                <w:iCs w:val="false"/>
+                <w:color w:val="000000"/>
+                <w:sz w:val="18"/>
+                <w:szCs w:val="18"/>
+              </w:rPr>
+              <w:t xml:space="preserve"/>
+            </w:r>
+          </w:p>
+        </w:tc>
+        <w:tc>
+          <w:tcPr>
             <w:tcW w:type="dxa" w:w="2900"/>
             <w:tcMar>
               <w:top w:type="dxa" w:w="20"/>
@@ -12951,6 +13960,38 @@
         <w:tc>
           <w:tcPr>
             <w:tcW w:type="dxa" w:w="3200"/>
+            <w:shd w:fill="F2F2F2" w:val="clear"/>
+            <w:tcMar>
+              <w:top w:type="dxa" w:w="20"/>
+              <w:left w:type="dxa" w:w="60"/>
+              <w:bottom w:type="dxa" w:w="20"/>
+              <w:right w:type="dxa" w:w="60"/>
+            </w:tcMar>
+            <w:vAlign w:val="center"/>
+          </w:tcPr>
+          <w:p>
+            <w:pPr>
+              <w:spacing w:after="0" w:before="0" w:line="240" w:lineRule="auto"/>
+              <w:jc w:val="left"/>
+            </w:pPr>
+            <w:r>
+              <w:rPr>
+                <w:rFonts w:ascii="Calibri" w:cs="Calibri" w:eastAsia="Calibri" w:hAnsi="Calibri"/>
+                <w:b w:val="false"/>
+                <w:bCs w:val="false"/>
+                <w:i w:val="false"/>
+                <w:iCs w:val="false"/>
+                <w:color w:val="000000"/>
+                <w:sz w:val="18"/>
+                <w:szCs w:val="18"/>
+              </w:rPr>
+              <w:t xml:space="preserve"/>
+            </w:r>
+          </w:p>
+        </w:tc>
+        <w:tc>
+          <w:tcPr>
+            <w:tcW w:type="dxa" w:w="3300"/>
             <w:shd w:fill="F2F2F2" w:val="clear"/>
             <w:tcMar>
               <w:top w:type="dxa" w:w="20"/>

</xml_diff>